<commit_message>
Add OSL-staged Slide 2 geology layer
</commit_message>
<xml_diff>
--- a/docs/project_blueprints/V5_5_SLIDE2_SOURCE_UPDATE_North_Slope_Gas_Hydrate_ML_Workflow_Companion_2026-06-17.docx
+++ b/docs/project_blueprints/V5_5_SLIDE2_SOURCE_UPDATE_North_Slope_Gas_Hydrate_ML_Workflow_Companion_2026-06-17.docx
@@ -185,7 +185,7 @@
     </w:p>
     <w:p>
       <w:r>
-        <w:t>Rebuilt with the selected USGS/DOE page-3 stability source screenshot/crop as the primary stability visual, a project website regional map for North Slope context, and the project digitized methane 5 ppt CSV only as a small input inset. The slide explains that Structure I methane-dominant hydrate is the current baseline; Structure II and Structure H can occur with larger hydrocarbons such as ethane, propane, butane, or heavier guests, but they are not the current claim. Stability remains a pressure-temperature admissibility screen only; occurrence and saturation evidence must come from approved logs, core, NMR, and mentor-reviewed labels.</w:t>
+        <w:t>Rebuilt around the original context spine: what gas hydrates are and why the Alaska North Slope matters. This accepted Slide 2 direction uses a fuller World Atlas hydrate-structure figure crop with Structure I highlighted as the methane-dominant baseline assumption, a public DGGS RI 2018-6 Umiat-Gubik North Slope geology-layer preview showing map units, contacts/faults, and fold axes, a USGS Arctic Alaska generalized cross section, and the selected USGS/DOE pressure-temperature stability figure. Stability remains a pressure-temperature admissibility screen only; occurrence and saturation evidence must come from approved logs, core, NMR, and mentor-reviewed labels. The hydrate-structure figure remains marked for rights/caption review before public release.</w:t>
       </w:r>
     </w:p>
     <w:p>
@@ -656,7 +656,31 @@
         <w:pStyle w:val="ListBullet"/>
       </w:pPr>
       <w:r>
-        <w:t>Website regional map reference: https://drive.google.com/file/d/1CmfuViTiplCB9ayYOjSgLOiQlZaFGCx9/view?usp=drivesdk</w:t>
+        <w:t>DGGS RI 2018-6 geology-layer preview: docs/evidence/slide02_source_bundle_2026_06_17/slide02_selected_11_dggs_umiat_gubik_geology_layer_slide_map.png</w:t>
+      </w:r>
+    </w:p>
+    <w:p>
+      <w:pPr>
+        <w:pStyle w:val="ListBullet"/>
+      </w:pPr>
+      <w:r>
+        <w:t>Prior Structure Explorer 2D wells/seismic export retained as provenance: docs/evidence/slide02_source_bundle_2026_06_17/slide02_selected_05_structure_explorer_2d_wells_seismic.png</w:t>
+      </w:r>
+    </w:p>
+    <w:p>
+      <w:pPr>
+        <w:pStyle w:val="ListBullet"/>
+      </w:pPr>
+      <w:r>
+        <w:t>USGS Arctic Alaska generalized cross section crop: docs/evidence/slide02_source_bundle_2026_06_17/slide02_selected_06_usgs_arctic_alaska_cross_section_fig2_crop.png</w:t>
+      </w:r>
+    </w:p>
+    <w:p>
+      <w:pPr>
+        <w:pStyle w:val="ListBullet"/>
+      </w:pPr>
+      <w:r>
+        <w:t>World Atlas Fig. 1.1 hydrate structure crop with Structure I highlighted: docs/evidence/slide02_source_bundle_2026_06_17/slide02_selected_09_world_atlas_fig1_1_full_structure_types_si_highlighted.png. Use only after rights/caption review in public deliverables.</w:t>
       </w:r>
     </w:p>
     <w:p>

</xml_diff>

<commit_message>
Add Word companion science support handoff
</commit_message>
<xml_diff>
--- a/docs/project_blueprints/V5_5_SLIDE2_SOURCE_UPDATE_North_Slope_Gas_Hydrate_ML_Workflow_Companion_2026-06-17.docx
+++ b/docs/project_blueprints/V5_5_SLIDE2_SOURCE_UPDATE_North_Slope_Gas_Hydrate_ML_Workflow_Companion_2026-06-17.docx
@@ -723,6 +723,1093 @@
         <w:t>docs/STABILITY_CALCULATION_PLAN.md and public stability products for the stability overlay.</w:t>
       </w:r>
     </w:p>
+    <w:p>
+      <w:r>
+        <w:br w:type="page"/>
+      </w:r>
+    </w:p>
+    <w:p>
+      <w:pPr>
+        <w:pStyle w:val="Heading1"/>
+      </w:pPr>
+      <w:r>
+        <w:t>Science Support Notes For Revised Slides</w:t>
+      </w:r>
+    </w:p>
+    <w:p>
+      <w:r>
+        <w:t>These notes are the Word/end-material layer behind the revised slides. The slides should keep only short high-level phrases, while this companion holds the source logic, caveats, and manuscript-ready wording. Nothing in this section is a project result, occurrence proof, saturation estimate, producibility claim, or trained-model performance statement.</w:t>
+      </w:r>
+    </w:p>
+    <w:p>
+      <w:pPr>
+        <w:pStyle w:val="Heading2"/>
+      </w:pPr>
+      <w:r>
+        <w:t>Hydrate Structures, Gas Composition, And The Methane Baseline</w:t>
+      </w:r>
+    </w:p>
+    <w:p>
+      <w:r>
+        <w:t>Gas hydrate is a clathrate solid: water molecules form cages that physically trap guest gas molecules. Structure I is the baseline for methane-dominant hydrate and is the structure assumed by the current methane 5 ppt stability screen. Structure II can be stabilized by larger gas molecules and mixed natural gas components such as propane or isobutane. Structure H requires a larger hydrocarbon guest plus small helper gas such as methane. The slide deck can show Structure I, II, and H visually, but it should circle or otherwise emphasize Structure I because the current equations and stability products are methane baseline products unless a mentor-approved gas-composition sensitivity case is explicitly invoked.</w:t>
+      </w:r>
+    </w:p>
+    <w:p>
+      <w:r>
+        <w:t>Gas composition shifts the pressure-temperature stability boundary. A methane-only or methane-dominant phase curve is not the same as a mixed-gas phase curve. The current public workflow should therefore say methane baseline, not final gas chemistry, until gas composition data and scenario policy are approved.</w:t>
+      </w:r>
+    </w:p>
+    <w:p>
+      <w:pPr>
+        <w:pStyle w:val="Heading2"/>
+      </w:pPr>
+      <w:r>
+        <w:t>Biogenic Versus Thermogenic Gas</w:t>
+      </w:r>
+    </w:p>
+    <w:p>
+      <w:r>
+        <w:t>Biogenic methane is generated by microbial processes at relatively low temperatures, while thermogenic gas is generated by thermal maturation of organic matter at depth and commonly brings more C2+ hydrocarbon components into the discussion. For North Slope hydrate communication, this distinction matters because microbial methane supports a methane/Structure I baseline, while thermogenic or mixed gas introduces composition sensitivity and can move the phase boundary. The Word text should state that mixed microbial and thermogenic gas has been discussed in North Slope/Eileen Trend source literature, but the current project does not yet have approved gas-composition rows tied to the three-workbook runtime package.</w:t>
+      </w:r>
+    </w:p>
+    <w:p>
+      <w:pPr>
+        <w:pStyle w:val="Heading2"/>
+      </w:pPr>
+      <w:r>
+        <w:t>Why Gas Hydrates Matter As An Energy Resource</w:t>
+      </w:r>
+    </w:p>
+    <w:p>
+      <w:r>
+        <w:t>The project should use government resource estimates as regional motivation, not as a result of this workflow. The current project source ledger points to USGS Fact Sheet 2019-3037, which reports a 2018 USGS mean estimate of about 54 trillion cubic feet of undiscovered, technically recoverable gas resources within North Slope gas hydrates. Older project or background material may also mention the 2008 Department of the Interior/USGS release reporting 85.4 trillion cubic feet for an earlier assessment. If both numbers appear, keep the year and assessment basis next to the number so the deck does not look inconsistent.</w:t>
+      </w:r>
+    </w:p>
+    <w:p>
+      <w:r>
+        <w:t>A regional government resource estimate explains why North Slope hydrates are worth studying. It does not prove occurrence in any project interval, validate producibility, or replace well-log, core, NMR, pressure-temperature, and validation evidence.</w:t>
+      </w:r>
+    </w:p>
+    <w:p>
+      <w:pPr>
+        <w:pStyle w:val="Heading2"/>
+      </w:pPr>
+      <w:r>
+        <w:t>Reservoir Quality And Clean Sandstone</w:t>
+      </w:r>
+    </w:p>
+    <w:p>
+      <w:r>
+        <w:t>The project is framed around pore-filling hydrate in sand-rich permafrost-associated reservoirs. Clean, porous sandstone matters because pore-filling hydrate requires pore volume, connected reservoir quality, and a geologic setting that can charge and preserve hydrate. Low gamma ray can be a clean-sand or lower shale proxy, but it is only a reservoir-quality gate. High gamma ray, clay-rich zones, thin laminations, or poor sorting can reduce reservoir quality and can also distort resistivity, NMR, density, and sonic interpretation. Reservoir quality is a condition that makes hydrate interpretation more plausible, not a hydrate label by itself.</w:t>
+      </w:r>
+    </w:p>
+    <w:p>
+      <w:pPr>
+        <w:pStyle w:val="Heading2"/>
+      </w:pPr>
+      <w:r>
+        <w:t>Well, Lithology, And Core Evidence Status</w:t>
+      </w:r>
+    </w:p>
+    <w:p>
+      <w:r>
+        <w:t>The current runtime story should say that the approved-runtime prototype is organized around three curated workbooks or datasheets and a working four-well or four-case scope from the latest project direction. However, the public-safe header-only verification on this machine confirms only two named well aliases: MTE as Mount Elbert / Well-MTE and IGS as Ignik Sikumi / Well-IGS. It also finds MTE_refined and IGS_refined as refined or alignment sheet views, not verified additional distinct wells. MLK and ETG are not verified in committed public-safe metadata.</w:t>
+      </w:r>
+    </w:p>
+    <w:p>
+      <w:r>
+        <w:t>For source support, Mount Elbert is supported by public source literature as a cored and logged North Slope gas hydrate stratigraphic test well with NMR, P- and S-wave velocity, resistivity, and core/reservoir context. Ignik Sikumi is supported as an Eileen Trend case-study/production-test context in North Slope source literature. Hydrate-01 and newer HYDRATE 02 sources support the broader ANS log/core/NMR/reservoir logic, but they should not be silently treated as the same rows or labels as the current three-workbook runtime package. The missing item is a clean approved-runtime metadata export confirming exact workbook, sheet, well, location, lithology/core, NMR, pressure-core, and target-label provenance.</w:t>
+      </w:r>
+    </w:p>
+    <w:p>
+      <w:pPr>
+        <w:pStyle w:val="Heading2"/>
+      </w:pPr>
+      <w:r>
+        <w:t>Complementary Evidence, Not One-Curve Proof</w:t>
+      </w:r>
+    </w:p>
+    <w:tbl>
+      <w:tblPr>
+        <w:tblStyle w:val="TableGrid"/>
+        <w:tblW w:type="auto" w:w="0"/>
+        <w:tblLook w:firstColumn="1" w:firstRow="1" w:lastColumn="0" w:lastRow="0" w:noHBand="0" w:noVBand="1" w:val="04A0"/>
+      </w:tblPr>
+      <w:tblGrid>
+        <w:gridCol w:w="2592"/>
+        <w:gridCol w:w="2592"/>
+        <w:gridCol w:w="2592"/>
+        <w:gridCol w:w="2592"/>
+      </w:tblGrid>
+      <w:tr>
+        <w:tc>
+          <w:tcPr>
+            <w:tcW w:type="dxa" w:w="2592"/>
+          </w:tcPr>
+          <w:p>
+            <w:r>
+              <w:rPr>
+                <w:b/>
+              </w:rPr>
+              <w:t>Evidence family</w:t>
+            </w:r>
+          </w:p>
+        </w:tc>
+        <w:tc>
+          <w:tcPr>
+            <w:tcW w:type="dxa" w:w="2592"/>
+          </w:tcPr>
+          <w:p>
+            <w:r>
+              <w:rPr>
+                <w:b/>
+              </w:rPr>
+              <w:t>What it contributes</w:t>
+            </w:r>
+          </w:p>
+        </w:tc>
+        <w:tc>
+          <w:tcPr>
+            <w:tcW w:type="dxa" w:w="2592"/>
+          </w:tcPr>
+          <w:p>
+            <w:r>
+              <w:rPr>
+                <w:b/>
+              </w:rPr>
+              <w:t>Common mimic or limitation</w:t>
+            </w:r>
+          </w:p>
+        </w:tc>
+        <w:tc>
+          <w:tcPr>
+            <w:tcW w:type="dxa" w:w="2592"/>
+          </w:tcPr>
+          <w:p>
+            <w:r>
+              <w:rPr>
+                <w:b/>
+              </w:rPr>
+              <w:t>Word/slide role</w:t>
+            </w:r>
+          </w:p>
+        </w:tc>
+      </w:tr>
+      <w:tr>
+        <w:tc>
+          <w:tcPr>
+            <w:tcW w:type="dxa" w:w="2592"/>
+          </w:tcPr>
+          <w:p>
+            <w:r>
+              <w:t>GR / lithology</w:t>
+            </w:r>
+          </w:p>
+        </w:tc>
+        <w:tc>
+          <w:tcPr>
+            <w:tcW w:type="dxa" w:w="2592"/>
+          </w:tcPr>
+          <w:p>
+            <w:r>
+              <w:t>Clean-sand and reservoir-quality gate.</w:t>
+            </w:r>
+          </w:p>
+        </w:tc>
+        <w:tc>
+          <w:tcPr>
+            <w:tcW w:type="dxa" w:w="2592"/>
+          </w:tcPr>
+          <w:p>
+            <w:r>
+              <w:t>Clean non-hydrate sand, radioactive minerals, shale laminations, and depth mismatch.</w:t>
+            </w:r>
+          </w:p>
+        </w:tc>
+        <w:tc>
+          <w:tcPr>
+            <w:tcW w:type="dxa" w:w="2592"/>
+          </w:tcPr>
+          <w:p>
+            <w:r>
+              <w:t>Input/context, never hydrate proof.</w:t>
+            </w:r>
+          </w:p>
+        </w:tc>
+      </w:tr>
+      <w:tr>
+        <w:tc>
+          <w:tcPr>
+            <w:tcW w:type="dxa" w:w="2592"/>
+          </w:tcPr>
+          <w:p>
+            <w:r>
+              <w:t>Resistivity</w:t>
+            </w:r>
+          </w:p>
+        </w:tc>
+        <w:tc>
+          <w:tcPr>
+            <w:tcW w:type="dxa" w:w="2592"/>
+          </w:tcPr>
+          <w:p>
+            <w:r>
+              <w:t>Hydrate-compatible resistive pore fill when reservoir and water-salinity context fit.</w:t>
+            </w:r>
+          </w:p>
+        </w:tc>
+        <w:tc>
+          <w:tcPr>
+            <w:tcW w:type="dxa" w:w="2592"/>
+          </w:tcPr>
+          <w:p>
+            <w:r>
+              <w:t>Free gas, ice, cement, tight rock, invasion, salinity, and shale effects.</w:t>
+            </w:r>
+          </w:p>
+        </w:tc>
+        <w:tc>
+          <w:tcPr>
+            <w:tcW w:type="dxa" w:w="2592"/>
+          </w:tcPr>
+          <w:p>
+            <w:r>
+              <w:t>Strong feature only when paired with other evidence.</w:t>
+            </w:r>
+          </w:p>
+        </w:tc>
+      </w:tr>
+      <w:tr>
+        <w:tc>
+          <w:tcPr>
+            <w:tcW w:type="dxa" w:w="2592"/>
+          </w:tcPr>
+          <w:p>
+            <w:r>
+              <w:t>Density / porosity / NMR</w:t>
+            </w:r>
+          </w:p>
+        </w:tc>
+        <w:tc>
+          <w:tcPr>
+            <w:tcW w:type="dxa" w:w="2592"/>
+          </w:tcPr>
+          <w:p>
+            <w:r>
+              <w:t>Pore volume, mobile-water response, NMR-density separation, and calibration support.</w:t>
+            </w:r>
+          </w:p>
+        </w:tc>
+        <w:tc>
+          <w:tcPr>
+            <w:tcW w:type="dxa" w:w="2592"/>
+          </w:tcPr>
+          <w:p>
+            <w:r>
+              <w:t>Clay-bound water, depth mismatch, tool processing, missing NMR, or target leakage.</w:t>
+            </w:r>
+          </w:p>
+        </w:tc>
+        <w:tc>
+          <w:tcPr>
+            <w:tcW w:type="dxa" w:w="2592"/>
+          </w:tcPr>
+          <w:p>
+            <w:r>
+              <w:t>Measured inputs or target/calibration depending on header role.</w:t>
+            </w:r>
+          </w:p>
+        </w:tc>
+      </w:tr>
+      <w:tr>
+        <w:tc>
+          <w:tcPr>
+            <w:tcW w:type="dxa" w:w="2592"/>
+          </w:tcPr>
+          <w:p>
+            <w:r>
+              <w:t>Vp, Vs, Vp/Vs, impedance</w:t>
+            </w:r>
+          </w:p>
+        </w:tc>
+        <w:tc>
+          <w:tcPr>
+            <w:tcW w:type="dxa" w:w="2592"/>
+          </w:tcPr>
+          <w:p>
+            <w:r>
+              <w:t>Frame stiffness, velocity response, and elastic contrasts.</w:t>
+            </w:r>
+          </w:p>
+        </w:tc>
+        <w:tc>
+          <w:tcPr>
+            <w:tcW w:type="dxa" w:w="2592"/>
+          </w:tcPr>
+          <w:p>
+            <w:r>
+              <w:t>Compaction, cement, carbonate, ice, gas, stress, and unit-conversion errors.</w:t>
+            </w:r>
+          </w:p>
+        </w:tc>
+        <w:tc>
+          <w:tcPr>
+            <w:tcW w:type="dxa" w:w="2592"/>
+          </w:tcPr>
+          <w:p>
+            <w:r>
+              <w:t>Measured or derived features with provenance flags.</w:t>
+            </w:r>
+          </w:p>
+        </w:tc>
+      </w:tr>
+      <w:tr>
+        <w:tc>
+          <w:tcPr>
+            <w:tcW w:type="dxa" w:w="2592"/>
+          </w:tcPr>
+          <w:p>
+            <w:r>
+              <w:t>Core / pressure core</w:t>
+            </w:r>
+          </w:p>
+        </w:tc>
+        <w:tc>
+          <w:tcPr>
+            <w:tcW w:type="dxa" w:w="2592"/>
+          </w:tcPr>
+          <w:p>
+            <w:r>
+              <w:t>Lithology, porosity, permeability, pressure-core quality, and calibration evidence.</w:t>
+            </w:r>
+          </w:p>
+        </w:tc>
+        <w:tc>
+          <w:tcPr>
+            <w:tcW w:type="dxa" w:w="2592"/>
+          </w:tcPr>
+          <w:p>
+            <w:r>
+              <w:t>Sparse intervals, depth offsets, sampling bias, and disturbed samples.</w:t>
+            </w:r>
+          </w:p>
+        </w:tc>
+        <w:tc>
+          <w:tcPr>
+            <w:tcW w:type="dxa" w:w="2592"/>
+          </w:tcPr>
+          <w:p>
+            <w:r>
+              <w:t>Calibration/validation, not an automatic continuous label.</w:t>
+            </w:r>
+          </w:p>
+        </w:tc>
+      </w:tr>
+      <w:tr>
+        <w:tc>
+          <w:tcPr>
+            <w:tcW w:type="dxa" w:w="2592"/>
+          </w:tcPr>
+          <w:p>
+            <w:r>
+              <w:t>Caliper / washout QC</w:t>
+            </w:r>
+          </w:p>
+        </w:tc>
+        <w:tc>
+          <w:tcPr>
+            <w:tcW w:type="dxa" w:w="2592"/>
+          </w:tcPr>
+          <w:p>
+            <w:r>
+              <w:t>Whether log responses are trustworthy in the borehole.</w:t>
+            </w:r>
+          </w:p>
+        </w:tc>
+        <w:tc>
+          <w:tcPr>
+            <w:tcW w:type="dxa" w:w="2592"/>
+          </w:tcPr>
+          <w:p>
+            <w:r>
+              <w:t>Missing caliper, bit-size uncertainty, or bad-hole intervals.</w:t>
+            </w:r>
+          </w:p>
+        </w:tc>
+        <w:tc>
+          <w:tcPr>
+            <w:tcW w:type="dxa" w:w="2592"/>
+          </w:tcPr>
+          <w:p>
+            <w:r>
+              <w:t>QC only; not hydrate evidence.</w:t>
+            </w:r>
+          </w:p>
+        </w:tc>
+      </w:tr>
+      <w:tr>
+        <w:tc>
+          <w:tcPr>
+            <w:tcW w:type="dxa" w:w="2592"/>
+          </w:tcPr>
+          <w:p>
+            <w:r>
+              <w:t>P-T stability</w:t>
+            </w:r>
+          </w:p>
+        </w:tc>
+        <w:tc>
+          <w:tcPr>
+            <w:tcW w:type="dxa" w:w="2592"/>
+          </w:tcPr>
+          <w:p>
+            <w:r>
+              <w:t>Whether hydrate is admissible under a stated phase-curve and temperature model.</w:t>
+            </w:r>
+          </w:p>
+        </w:tc>
+        <w:tc>
+          <w:tcPr>
+            <w:tcW w:type="dxa" w:w="2592"/>
+          </w:tcPr>
+          <w:p>
+            <w:r>
+              <w:t>Gas chemistry, salinity, geothermal uncertainty, missing temperature profile.</w:t>
+            </w:r>
+          </w:p>
+        </w:tc>
+        <w:tc>
+          <w:tcPr>
+            <w:tcW w:type="dxa" w:w="2592"/>
+          </w:tcPr>
+          <w:p>
+            <w:r>
+              <w:t>Context/screen/caveat only.</w:t>
+            </w:r>
+          </w:p>
+        </w:tc>
+      </w:tr>
+    </w:tbl>
+    <w:p>
+      <w:pPr>
+        <w:pStyle w:val="Heading2"/>
+      </w:pPr>
+      <w:r>
+        <w:t>Equations As Screening Transformations</w:t>
+      </w:r>
+    </w:p>
+    <w:p>
+      <w:r>
+        <w:t>The equations in the slide and Word logic are physics and screening transformations. They convert measured or approved-context quantities into interpretable features or admissibility checks. Examples include hydrostatic pressure from depth, temperature-gradient or profile-based temperature, methane 5 ppt phase boundary lookup, density porosity, Archie-style water/hydrate saturation reference logic, sonic slowness to Vp/Vs, acoustic impedance, and elastic attributes such as mu-rho and lambda-rho. These transformations can support feature engineering and review, but they cannot prove hydrate without aligned labels, lithology, core/NMR support, QC, and validation.</w:t>
+      </w:r>
+    </w:p>
+    <w:p>
+      <w:r>
+        <w:t>If a saturation-like equation or field creates Sgh, S_h, Sh, NMR_SAT, Hydrate Saturation, Swr, S_wr, an occurrence label, or an interpreted phase label, it belongs on the Y-only/calibration side. It can supervise or validate a model after mentor approval; it must not enter X_allowed as an ordinary predictor.</w:t>
+      </w:r>
+    </w:p>
+    <w:p>
+      <w:pPr>
+        <w:pStyle w:val="Heading2"/>
+      </w:pPr>
+      <w:r>
+        <w:t>Current ML Scope: Three Workbooks And Four Working Cases</w:t>
+      </w:r>
+    </w:p>
+    <w:p>
+      <w:r>
+        <w:t>The ML draft should describe the three curated workbook/datasheet package as a controlled approved-runtime prototype. Its purpose is to preserve original headers, discover schema families, enforce target leakage rules, test train-only 0-1 scaling, and exercise occurrence-classification and saturation-regression code paths without exposing approved rows. Saturation targets should be treated as fractions on a 0-1 scale, with sheet-level runtime verification still required. Depth remains the alignment axis unless mentor approval changes that policy.</w:t>
+      </w:r>
+    </w:p>
+    <w:p>
+      <w:r>
+        <w:t>The public wording should say that the current project direction is a four-well/four-case ML scope from three workbooks, but that public-safe metadata has not yet verified four distinct actual wells. Final model training, occurrence classes, saturation regression claims, and performance metrics wait for the approved workbook metadata, target authority, lithology/core support, and whole-well or grouped validation split.</w:t>
+      </w:r>
+    </w:p>
+    <w:p>
+      <w:pPr>
+        <w:pStyle w:val="Heading1"/>
+      </w:pPr>
+      <w:r>
+        <w:t>Detailed Source Anchors For Word / End Material</w:t>
+      </w:r>
+    </w:p>
+    <w:p>
+      <w:r>
+        <w:t>Use these as manuscript or companion citations. Do not cite internal source maps, screenshot filenames, prompts, or artifact indexes as scientific sources.</w:t>
+      </w:r>
+    </w:p>
+    <w:tbl>
+      <w:tblPr>
+        <w:tblStyle w:val="TableGrid"/>
+        <w:tblW w:type="auto" w:w="0"/>
+        <w:tblLook w:firstColumn="1" w:firstRow="1" w:lastColumn="0" w:lastRow="0" w:noHBand="0" w:noVBand="1" w:val="04A0"/>
+      </w:tblPr>
+      <w:tblGrid>
+        <w:gridCol w:w="2592"/>
+        <w:gridCol w:w="2592"/>
+        <w:gridCol w:w="2592"/>
+        <w:gridCol w:w="2592"/>
+      </w:tblGrid>
+      <w:tr>
+        <w:tc>
+          <w:tcPr>
+            <w:tcW w:type="dxa" w:w="2592"/>
+          </w:tcPr>
+          <w:p>
+            <w:r>
+              <w:rPr>
+                <w:b/>
+              </w:rPr>
+              <w:t>Source</w:t>
+            </w:r>
+          </w:p>
+        </w:tc>
+        <w:tc>
+          <w:tcPr>
+            <w:tcW w:type="dxa" w:w="2592"/>
+          </w:tcPr>
+          <w:p>
+            <w:r>
+              <w:rPr>
+                <w:b/>
+              </w:rPr>
+              <w:t>Supports</w:t>
+            </w:r>
+          </w:p>
+        </w:tc>
+        <w:tc>
+          <w:tcPr>
+            <w:tcW w:type="dxa" w:w="2592"/>
+          </w:tcPr>
+          <w:p>
+            <w:r>
+              <w:rPr>
+                <w:b/>
+              </w:rPr>
+              <w:t>Use in Word companion</w:t>
+            </w:r>
+          </w:p>
+        </w:tc>
+        <w:tc>
+          <w:tcPr>
+            <w:tcW w:type="dxa" w:w="2592"/>
+          </w:tcPr>
+          <w:p>
+            <w:r>
+              <w:rPr>
+                <w:b/>
+              </w:rPr>
+              <w:t>Guardrail</w:t>
+            </w:r>
+          </w:p>
+        </w:tc>
+      </w:tr>
+      <w:tr>
+        <w:tc>
+          <w:tcPr>
+            <w:tcW w:type="dxa" w:w="2592"/>
+          </w:tcPr>
+          <w:p>
+            <w:r>
+              <w:t>USGS Modern Perspective on Gas Hydrates, https://www.usgs.gov/news/featured-story/modern-perspective-gas-hydrates</w:t>
+            </w:r>
+          </w:p>
+        </w:tc>
+        <w:tc>
+          <w:tcPr>
+            <w:tcW w:type="dxa" w:w="2592"/>
+          </w:tcPr>
+          <w:p>
+            <w:r>
+              <w:t>Basic gas hydrate definition, permafrost and marine settings, public-domain context.</w:t>
+            </w:r>
+          </w:p>
+        </w:tc>
+        <w:tc>
+          <w:tcPr>
+            <w:tcW w:type="dxa" w:w="2592"/>
+          </w:tcPr>
+          <w:p>
+            <w:r>
+              <w:t>Short definition and why hydrates are investigated as an energy/resource topic.</w:t>
+            </w:r>
+          </w:p>
+        </w:tc>
+        <w:tc>
+          <w:tcPr>
+            <w:tcW w:type="dxa" w:w="2592"/>
+          </w:tcPr>
+          <w:p>
+            <w:r>
+              <w:t>Background only; not North Slope interval proof.</w:t>
+            </w:r>
+          </w:p>
+        </w:tc>
+      </w:tr>
+      <w:tr>
+        <w:tc>
+          <w:tcPr>
+            <w:tcW w:type="dxa" w:w="2592"/>
+          </w:tcPr>
+          <w:p>
+            <w:r>
+              <w:t>Sloan and Koh, Clathrate Hydrates of Natural Gases, 3rd ed.; World Atlas structure figure used in Slide 2</w:t>
+            </w:r>
+          </w:p>
+        </w:tc>
+        <w:tc>
+          <w:tcPr>
+            <w:tcW w:type="dxa" w:w="2592"/>
+          </w:tcPr>
+          <w:p>
+            <w:r>
+              <w:t>Structure I, Structure II, Structure H, guest-size and gas-composition logic.</w:t>
+            </w:r>
+          </w:p>
+        </w:tc>
+        <w:tc>
+          <w:tcPr>
+            <w:tcW w:type="dxa" w:w="2592"/>
+          </w:tcPr>
+          <w:p>
+            <w:r>
+              <w:t>Explain why methane/Structure I is the current baseline and mixed-gas cases are sensitivity scenarios.</w:t>
+            </w:r>
+          </w:p>
+        </w:tc>
+        <w:tc>
+          <w:tcPr>
+            <w:tcW w:type="dxa" w:w="2592"/>
+          </w:tcPr>
+          <w:p>
+            <w:r>
+              <w:t>Check figure rights/captions before public release.</w:t>
+            </w:r>
+          </w:p>
+        </w:tc>
+      </w:tr>
+      <w:tr>
+        <w:tc>
+          <w:tcPr>
+            <w:tcW w:type="dxa" w:w="2592"/>
+          </w:tcPr>
+          <w:p>
+            <w:r>
+              <w:t>USGS OF 96-272 biogenic vs thermogenic discussion, https://pubs.usgs.gov/of/1996/of96-272/ch03s07.html</w:t>
+            </w:r>
+          </w:p>
+        </w:tc>
+        <w:tc>
+          <w:tcPr>
+            <w:tcW w:type="dxa" w:w="2592"/>
+          </w:tcPr>
+          <w:p>
+            <w:r>
+              <w:t>Thermogenic/mixed gases can include ethane/propane and shift stability relative to methane.</w:t>
+            </w:r>
+          </w:p>
+        </w:tc>
+        <w:tc>
+          <w:tcPr>
+            <w:tcW w:type="dxa" w:w="2592"/>
+          </w:tcPr>
+          <w:p>
+            <w:r>
+              <w:t>Explain why gas source and composition matter for phase-boundary policy.</w:t>
+            </w:r>
+          </w:p>
+        </w:tc>
+        <w:tc>
+          <w:tcPr>
+            <w:tcW w:type="dxa" w:w="2592"/>
+          </w:tcPr>
+          <w:p>
+            <w:r>
+              <w:t>Do not infer workbook gas composition without approved rows.</w:t>
+            </w:r>
+          </w:p>
+        </w:tc>
+      </w:tr>
+      <w:tr>
+        <w:tc>
+          <w:tcPr>
+            <w:tcW w:type="dxa" w:w="2592"/>
+          </w:tcPr>
+          <w:p>
+            <w:r>
+              <w:t>Collett et al. 2019, USGS Fact Sheet 2019-3037, https://doi.org/10.3133/fs20193037</w:t>
+            </w:r>
+          </w:p>
+        </w:tc>
+        <w:tc>
+          <w:tcPr>
+            <w:tcW w:type="dxa" w:w="2592"/>
+          </w:tcPr>
+          <w:p>
+            <w:r>
+              <w:t>2018 North Slope gas hydrate assessment; about 54 Tcf mean undiscovered technically recoverable gas.</w:t>
+            </w:r>
+          </w:p>
+        </w:tc>
+        <w:tc>
+          <w:tcPr>
+            <w:tcW w:type="dxa" w:w="2592"/>
+          </w:tcPr>
+          <w:p>
+            <w:r>
+              <w:t>Current regional motivation/resource estimate.</w:t>
+            </w:r>
+          </w:p>
+        </w:tc>
+        <w:tc>
+          <w:tcPr>
+            <w:tcW w:type="dxa" w:w="2592"/>
+          </w:tcPr>
+          <w:p>
+            <w:r>
+              <w:t>Regional estimate only, not project validation or producibility proof.</w:t>
+            </w:r>
+          </w:p>
+        </w:tc>
+      </w:tr>
+      <w:tr>
+        <w:tc>
+          <w:tcPr>
+            <w:tcW w:type="dxa" w:w="2592"/>
+          </w:tcPr>
+          <w:p>
+            <w:r>
+              <w:t>DOI/USGS 2008 North Slope gas hydrate assessment release, https://www.doi.gov/sites/default/files/archive/news/archive/08_News_Releases/111208.html</w:t>
+            </w:r>
+          </w:p>
+        </w:tc>
+        <w:tc>
+          <w:tcPr>
+            <w:tcW w:type="dxa" w:w="2592"/>
+          </w:tcPr>
+          <w:p>
+            <w:r>
+              <w:t>Older estimate of 85.4 Tcf technically recoverable gas from North Slope hydrates.</w:t>
+            </w:r>
+          </w:p>
+        </w:tc>
+        <w:tc>
+          <w:tcPr>
+            <w:tcW w:type="dxa" w:w="2592"/>
+          </w:tcPr>
+          <w:p>
+            <w:r>
+              <w:t>Historical comparison only if older slides or notes mention 85.4 Tcf.</w:t>
+            </w:r>
+          </w:p>
+        </w:tc>
+        <w:tc>
+          <w:tcPr>
+            <w:tcW w:type="dxa" w:w="2592"/>
+          </w:tcPr>
+          <w:p>
+            <w:r>
+              <w:t>Keep date/assessment basis attached; do not mix with 2018 estimate.</w:t>
+            </w:r>
+          </w:p>
+        </w:tc>
+      </w:tr>
+      <w:tr>
+        <w:tc>
+          <w:tcPr>
+            <w:tcW w:type="dxa" w:w="2592"/>
+          </w:tcPr>
+          <w:p>
+            <w:r>
+              <w:t>Collett, Boswell, and Zyrianova 2022, Alaska North Slope terrestrial gas hydrate systems, https://doi.org/10.1007/978-3-030-81186-0_16</w:t>
+            </w:r>
+          </w:p>
+        </w:tc>
+        <w:tc>
+          <w:tcPr>
+            <w:tcW w:type="dxa" w:w="2592"/>
+          </w:tcPr>
+          <w:p>
+            <w:r>
+              <w:t>Mount Elbert, Ignik Sikumi, Hydrate-01, scientific-drilling context, and regional resource framing.</w:t>
+            </w:r>
+          </w:p>
+        </w:tc>
+        <w:tc>
+          <w:tcPr>
+            <w:tcW w:type="dxa" w:w="2592"/>
+          </w:tcPr>
+          <w:p>
+            <w:r>
+              <w:t>Connect four-case runtime discussion to known ANS case-study wells without overclaiming workbook mapping.</w:t>
+            </w:r>
+          </w:p>
+        </w:tc>
+        <w:tc>
+          <w:tcPr>
+            <w:tcW w:type="dxa" w:w="2592"/>
+          </w:tcPr>
+          <w:p>
+            <w:r>
+              <w:t>Source context; not proof that current workbooks contain every cited well.</w:t>
+            </w:r>
+          </w:p>
+        </w:tc>
+      </w:tr>
+      <w:tr>
+        <w:tc>
+          <w:tcPr>
+            <w:tcW w:type="dxa" w:w="2592"/>
+          </w:tcPr>
+          <w:p>
+            <w:r>
+              <w:t>Lee and Collett 2011, Mount Elbert in-situ saturation from well logs, https://doi.org/10.1016/j.marpetgeo.2009.06.007</w:t>
+            </w:r>
+          </w:p>
+        </w:tc>
+        <w:tc>
+          <w:tcPr>
+            <w:tcW w:type="dxa" w:w="2592"/>
+          </w:tcPr>
+          <w:p>
+            <w:r>
+              <w:t>NMR, P- and S-wave velocity, resistivity, core/reservoir data, and saturation-method comparison.</w:t>
+            </w:r>
+          </w:p>
+        </w:tc>
+        <w:tc>
+          <w:tcPr>
+            <w:tcW w:type="dxa" w:w="2592"/>
+          </w:tcPr>
+          <w:p>
+            <w:r>
+              <w:t>Support complementary evidence and MTE/Mount Elbert source context.</w:t>
+            </w:r>
+          </w:p>
+        </w:tc>
+        <w:tc>
+          <w:tcPr>
+            <w:tcW w:type="dxa" w:w="2592"/>
+          </w:tcPr>
+          <w:p>
+            <w:r>
+              <w:t>Do not copy source saturation values as project outputs.</w:t>
+            </w:r>
+          </w:p>
+        </w:tc>
+      </w:tr>
+      <w:tr>
+        <w:tc>
+          <w:tcPr>
+            <w:tcW w:type="dxa" w:w="2592"/>
+          </w:tcPr>
+          <w:p>
+            <w:r>
+              <w:t>Haines et al. 2022, Hydrate-01 well-log saturation and reservoir characteristics, https://doi.org/10.1021/acs.energyfuels.1c04100</w:t>
+            </w:r>
+          </w:p>
+        </w:tc>
+        <w:tc>
+          <w:tcPr>
+            <w:tcW w:type="dxa" w:w="2592"/>
+          </w:tcPr>
+          <w:p>
+            <w:r>
+              <w:t>Sonic, resistivity, NMR comparison; reservoir quality, shale fraction, permeability, and Vp/Vs discussion.</w:t>
+            </w:r>
+          </w:p>
+        </w:tc>
+        <w:tc>
+          <w:tcPr>
+            <w:tcW w:type="dxa" w:w="2592"/>
+          </w:tcPr>
+          <w:p>
+            <w:r>
+              <w:t>Support why reservoir quality and multiple log families are needed.</w:t>
+            </w:r>
+          </w:p>
+        </w:tc>
+        <w:tc>
+          <w:tcPr>
+            <w:tcW w:type="dxa" w:w="2592"/>
+          </w:tcPr>
+          <w:p>
+            <w:r>
+              <w:t>Hydrate-01 context is not automatically the current three-workbook data.</w:t>
+            </w:r>
+          </w:p>
+        </w:tc>
+      </w:tr>
+      <w:tr>
+        <w:tc>
+          <w:tcPr>
+            <w:tcW w:type="dxa" w:w="2592"/>
+          </w:tcPr>
+          <w:p>
+            <w:r>
+              <w:t>Zyrianova, Collett, and Boswell 2024, Eileen Gas Hydrate Trend controls, https://doi.org/10.3390/jmse12030472</w:t>
+            </w:r>
+          </w:p>
+        </w:tc>
+        <w:tc>
+          <w:tcPr>
+            <w:tcW w:type="dxa" w:w="2592"/>
+          </w:tcPr>
+          <w:p>
+            <w:r>
+              <w:t>Structural-stratigraphic traps, sand-bed controls, partial hydrate fill, and water contacts.</w:t>
+            </w:r>
+          </w:p>
+        </w:tc>
+        <w:tc>
+          <w:tcPr>
+            <w:tcW w:type="dxa" w:w="2592"/>
+          </w:tcPr>
+          <w:p>
+            <w:r>
+              <w:t>Explain why geology and clean reservoir context must accompany logs and ML.</w:t>
+            </w:r>
+          </w:p>
+        </w:tc>
+        <w:tc>
+          <w:tcPr>
+            <w:tcW w:type="dxa" w:w="2592"/>
+          </w:tcPr>
+          <w:p>
+            <w:r>
+              <w:t>Regional/source interpretation only, not ML labels.</w:t>
+            </w:r>
+          </w:p>
+        </w:tc>
+      </w:tr>
+      <w:tr>
+        <w:tc>
+          <w:tcPr>
+            <w:tcW w:type="dxa" w:w="2592"/>
+          </w:tcPr>
+          <w:p>
+            <w:r>
+              <w:t>Aung et al. 2026, Alaska North Slope LWD data acquisition, https://doi.org/10.1021/acs.energyfuels.5c06115</w:t>
+            </w:r>
+          </w:p>
+        </w:tc>
+        <w:tc>
+          <w:tcPr>
+            <w:tcW w:type="dxa" w:w="2592"/>
+          </w:tcPr>
+          <w:p>
+            <w:r>
+              <w:t>Direct ANS LWD suite, QC, GR/resistivity/density/neutron/sonic/NMR context, and completion-selection logic.</w:t>
+            </w:r>
+          </w:p>
+        </w:tc>
+        <w:tc>
+          <w:tcPr>
+            <w:tcW w:type="dxa" w:w="2592"/>
+          </w:tcPr>
+          <w:p>
+            <w:r>
+              <w:t>Use for direct ANS log-family and QC support.</w:t>
+            </w:r>
+          </w:p>
+        </w:tc>
+        <w:tc>
+          <w:tcPr>
+            <w:tcW w:type="dxa" w:w="2592"/>
+          </w:tcPr>
+          <w:p>
+            <w:r>
+              <w:t>Do not use source quick-look intervals as project results.</w:t>
+            </w:r>
+          </w:p>
+        </w:tc>
+      </w:tr>
+      <w:tr>
+        <w:tc>
+          <w:tcPr>
+            <w:tcW w:type="dxa" w:w="2592"/>
+          </w:tcPr>
+          <w:p>
+            <w:r>
+              <w:t>Yoneda et al. 2026, ANS HYDRATE 02 NMR T2/permeability, https://doi.org/10.1021/acs.energyfuels.5c05321</w:t>
+            </w:r>
+          </w:p>
+        </w:tc>
+        <w:tc>
+          <w:tcPr>
+            <w:tcW w:type="dxa" w:w="2592"/>
+          </w:tcPr>
+          <w:p>
+            <w:r>
+              <w:t>NMR T2, pressure-core/lab permeability, reservoir/seal behavior, and permeability calibration.</w:t>
+            </w:r>
+          </w:p>
+        </w:tc>
+        <w:tc>
+          <w:tcPr>
+            <w:tcW w:type="dxa" w:w="2592"/>
+          </w:tcPr>
+          <w:p>
+            <w:r>
+              <w:t>Support NMR/core calibration and producibility-context discussion.</w:t>
+            </w:r>
+          </w:p>
+        </w:tc>
+        <w:tc>
+          <w:tcPr>
+            <w:tcW w:type="dxa" w:w="2592"/>
+          </w:tcPr>
+          <w:p>
+            <w:r>
+              <w:t>Permeability is context/calibration, not an occurrence label.</w:t>
+            </w:r>
+          </w:p>
+        </w:tc>
+      </w:tr>
+      <w:tr>
+        <w:tc>
+          <w:tcPr>
+            <w:tcW w:type="dxa" w:w="2592"/>
+          </w:tcPr>
+          <w:p>
+            <w:r>
+              <w:t>Singh, Seol, and Myshakin 2021, https://www.osti.gov/servlets/purl/1893637; Chong et al. 2024 / USGS, https://pubs.usgs.gov/publication/70250169</w:t>
+            </w:r>
+          </w:p>
+        </w:tc>
+        <w:tc>
+          <w:tcPr>
+            <w:tcW w:type="dxa" w:w="2592"/>
+          </w:tcPr>
+          <w:p>
+            <w:r>
+              <w:t>Leakage-safe well-log ML, selected feature families, occurrence classification, and saturation regression architecture.</w:t>
+            </w:r>
+          </w:p>
+        </w:tc>
+        <w:tc>
+          <w:tcPr>
+            <w:tcW w:type="dxa" w:w="2592"/>
+          </w:tcPr>
+          <w:p>
+            <w:r>
+              <w:t>Support separate occurrence and saturation model heads, baselines first, and ANN/Keras as later candidate.</w:t>
+            </w:r>
+          </w:p>
+        </w:tc>
+        <w:tc>
+          <w:tcPr>
+            <w:tcW w:type="dxa" w:w="2592"/>
+          </w:tcPr>
+          <w:p>
+            <w:r>
+              <w:t>Method anchor only; no project model metrics yet.</w:t>
+            </w:r>
+          </w:p>
+        </w:tc>
+      </w:tr>
+    </w:tbl>
     <w:sectPr>
       <w:pgSz w:w="12240" w:h="15840"/>
       <w:pgMar w:top="864" w:right="936" w:bottom="864" w:left="936" w:header="720" w:footer="720" w:gutter="0"/>

</xml_diff>